<commit_message>
docs: synchronise Word report with CUS2 heuristic weight 0.8
</commit_message>
<xml_diff>
--- a/A2A_Report_Draft.docx
+++ b/A2A_Report_Draft.docx
@@ -1093,7 +1093,7 @@
     </w:p>
     <w:p>
       <w:r>
-        <w:t>The three lines are:</w:t>
+        <w:t>The first three output lines are:</w:t>
       </w:r>
     </w:p>
     <w:p>
@@ -1113,16 +1113,7 @@
     </w:p>
     <w:p>
       <w:r>
-        <w:t xml:space="preserve">“Nodes created” means nodes in the </w:t>
-      </w:r>
-      <w:r>
-        <w:rPr>
-          <w:b/>
-        </w:rPr>
-        <w:t>search tree</w:t>
-      </w:r>
-      <w:r>
-        <w:t>: the start node, plus every successor that was placed on the frontier. It is not the number of nodes drawn on the map. A child that would repeat a node already on the current branch is not created.</w:t>
+        <w:t>“Nodes created” counts search-tree nodes: the start plus each successor added to the frontier. It is not the number of map locations. Children that repeat a node on the current branch are not created. The current CLI also appends labelled goal, created-node count, cost, steps, and arrow-path lines. A strict three-line submission format would require omitting these extra lines.</w:t>
       </w:r>
     </w:p>
     <w:p>
@@ -1201,7 +1192,7 @@
     </w:p>
     <w:p>
       <w:r>
-        <w:t>A state is the id of the current graph node. An action is “follow one outgoing edge”. The path cost is the sum of edge costs. For BFS and CUS2 we also care about the number of edges, called moves or hops. The goal test succeeds when the current node is any member of the destination set. The search may stop at the first success. It does not have to visit the other destinations. Section 6 removes that shortcut.</w:t>
+        <w:t>A state is the current graph-node ID. An action follows one outgoing edge. Path cost is the sum of edge costs. BFS minimises moves (edges); AS, CUS1 and revised CUS2 minimise total cost. Reaching any destination is sufficient for these four methods. Section 6 studies visiting every destination.</w:t>
       </w:r>
     </w:p>
     <w:p>
@@ -1748,16 +1739,7 @@
     </w:p>
     <w:p>
       <w:r>
-        <w:t xml:space="preserve">The goal is tested when a node is </w:t>
-      </w:r>
-      <w:r>
-        <w:rPr>
-          <w:b/>
-        </w:rPr>
-        <w:t>removed</w:t>
-      </w:r>
-      <w:r>
-        <w:t xml:space="preserve"> from the frontier, not when it is first generated. For A* and uniform-cost search this is the rule that makes the first destination we expand an optimal one: any cheaper path would still be sitting in the frontier with a better rank.</w:t>
+        <w:t>The goal is tested when removed from the frontier, not when first generated. With non-negative costs and an admissible heuristic, AS and revised CUS2 return a minimum-cost route; CUS1 requires no heuristic. A newly generated goal may still have a better competing path on the frontier.</w:t>
       </w:r>
     </w:p>
     <w:p>
@@ -1812,6 +1794,7 @@
           </w:tcPr>
           <w:p>
             <w:pPr>
+              <w:keepNext/>
               <w:spacing w:line="252" w:lineRule="auto" w:after="60"/>
             </w:pPr>
             <w:r>
@@ -1843,6 +1826,7 @@
           </w:tcPr>
           <w:p>
             <w:pPr>
+              <w:keepNext/>
               <w:spacing w:line="252" w:lineRule="auto" w:after="60"/>
             </w:pPr>
             <w:r>
@@ -1874,6 +1858,7 @@
           </w:tcPr>
           <w:p>
             <w:pPr>
+              <w:keepNext/>
               <w:spacing w:line="252" w:lineRule="auto" w:after="60"/>
             </w:pPr>
             <w:r>
@@ -1905,6 +1890,7 @@
           </w:tcPr>
           <w:p>
             <w:pPr>
+              <w:keepNext/>
               <w:spacing w:line="252" w:lineRule="auto" w:after="60"/>
             </w:pPr>
             <w:r>
@@ -1941,6 +1927,7 @@
           </w:tcPr>
           <w:p>
             <w:pPr>
+              <w:keepNext/>
               <w:spacing w:line="252" w:lineRule="auto" w:after="60"/>
             </w:pPr>
             <w:r>
@@ -1971,6 +1958,7 @@
           </w:tcPr>
           <w:p>
             <w:pPr>
+              <w:keepNext/>
               <w:spacing w:line="252" w:lineRule="auto" w:after="60"/>
             </w:pPr>
             <w:r>
@@ -2001,6 +1989,7 @@
           </w:tcPr>
           <w:p>
             <w:pPr>
+              <w:keepNext/>
               <w:spacing w:line="252" w:lineRule="auto" w:after="60"/>
             </w:pPr>
             <w:r>
@@ -2031,6 +2020,7 @@
           </w:tcPr>
           <w:p>
             <w:pPr>
+              <w:keepNext/>
               <w:spacing w:line="252" w:lineRule="auto" w:after="60"/>
             </w:pPr>
             <w:r>
@@ -2066,6 +2056,7 @@
           </w:tcPr>
           <w:p>
             <w:pPr>
+              <w:keepNext/>
               <w:spacing w:line="252" w:lineRule="auto" w:after="60"/>
             </w:pPr>
             <w:r>
@@ -2096,6 +2087,7 @@
           </w:tcPr>
           <w:p>
             <w:pPr>
+              <w:keepNext/>
               <w:spacing w:line="252" w:lineRule="auto" w:after="60"/>
             </w:pPr>
             <w:r>
@@ -2126,6 +2118,7 @@
           </w:tcPr>
           <w:p>
             <w:pPr>
+              <w:keepNext/>
               <w:spacing w:line="252" w:lineRule="auto" w:after="60"/>
             </w:pPr>
             <w:r>
@@ -2156,6 +2149,7 @@
           </w:tcPr>
           <w:p>
             <w:pPr>
+              <w:keepNext/>
               <w:spacing w:line="252" w:lineRule="auto" w:after="60"/>
             </w:pPr>
             <w:r>
@@ -2191,6 +2185,7 @@
           </w:tcPr>
           <w:p>
             <w:pPr>
+              <w:keepNext/>
               <w:spacing w:line="252" w:lineRule="auto" w:after="60"/>
             </w:pPr>
             <w:r>
@@ -2221,6 +2216,7 @@
           </w:tcPr>
           <w:p>
             <w:pPr>
+              <w:keepNext/>
               <w:spacing w:line="252" w:lineRule="auto" w:after="60"/>
             </w:pPr>
             <w:r>
@@ -2251,6 +2247,7 @@
           </w:tcPr>
           <w:p>
             <w:pPr>
+              <w:keepNext/>
               <w:spacing w:line="252" w:lineRule="auto" w:after="60"/>
             </w:pPr>
             <w:r>
@@ -2281,6 +2278,7 @@
           </w:tcPr>
           <w:p>
             <w:pPr>
+              <w:keepNext/>
               <w:spacing w:line="252" w:lineRule="auto" w:after="60"/>
             </w:pPr>
             <w:r>
@@ -2375,14 +2373,8 @@
             </w:tcMar>
           </w:tcPr>
           <w:p>
-            <w:pPr>
-              <w:spacing w:line="252" w:lineRule="auto" w:after="60"/>
-            </w:pPr>
             <w:r>
-              <w:rPr>
-                <w:sz w:val="18"/>
-              </w:rPr>
-              <w:t>Number of moves</w:t>
+              <w:t>Path cost</w:t>
             </w:r>
           </w:p>
         </w:tc>
@@ -2405,14 +2397,8 @@
             </w:tcMar>
           </w:tcPr>
           <w:p>
-            <w:pPr>
-              <w:spacing w:line="252" w:lineRule="auto" w:after="60"/>
-            </w:pPr>
             <w:r>
-              <w:rPr>
-                <w:sz w:val="18"/>
-              </w:rPr>
-              <w:t>f = depth + h_moves</w:t>
+              <w:t>f = g + 0.8 h_cost</w:t>
             </w:r>
           </w:p>
         </w:tc>
@@ -2543,35 +2529,24 @@
       </w:r>
     </w:p>
     <w:p>
-      <w:r/>
       <w:r>
-        <w:rPr>
-          <w:b/>
-        </w:rPr>
-        <w:t>CUS2</w:t>
-      </w:r>
-      <w:r>
-        <w:t xml:space="preserve"> is A* aimed at moves rather than cost. Each edge counts as one move, so </w:t>
-      </w:r>
-      <w:r>
-        <w:rPr>
-          <w:rFonts w:ascii="Consolas" w:hAnsi="Consolas"/>
-          <w:sz w:val="20"/>
-        </w:rPr>
-        <w:t>g</w:t>
-      </w:r>
-      <w:r>
-        <w:t xml:space="preserve"> is the depth. The heuristic is</w:t>
+        <w:t>CUS2 is A* with a scaled cost heuristic. It now minimises total edge cost, using the same nearest-goal straight-line estimate as AS. It no longer uses a move-count heuristic or divides by the longest edge length.</w:t>
       </w:r>
     </w:p>
     <w:p>
       <w:r>
-        <w:t>h_moves(n) = (straight-line distance to the nearest destination) / L</w:t>
+        <w:t>f(n) = g(n) + 0.8 × h_cost(n)</w:t>
       </w:r>
     </w:p>
     <w:p>
       <w:r>
-        <w:t>where L is the longest straight-line length of any edge on that map. One move covers at most L, so the number of moves still required is at least distance / L. The heuristic does not overestimate, and the first destination expanded has the fewest moves. On the sample map L ≈ 3.162 and h_moves(2) ≈ 4.123 / 3.162 ≈ 1.30, so A* expects a little more than one move even though two moves are actually needed. That is a legal underestimate.</w:t>
+        <w:t>The weight keeps 80% of the heuristic estimate while leaving actual edge costs unchanged. At w = 0 the ranking is UCS; at w = 1 it is ordinary A*. The setting 0.8 is a conservative experimental choice, not a proven best value or speed improvement.</w:t>
+      </w:r>
+    </w:p>
+    <w:p>
+      <w:pPr/>
+      <w:r>
+        <w:t>Weighted A* research commonly studies heuristic inflation with w &gt; 1 to trade solution quality for stronger goal direction (Ebendt and Drechsler 2009). Our w &lt; 1 variant instead weakens the heuristic; that paper does not identify 0.8 as an optimal setting.</w:t>
       </w:r>
     </w:p>
     <w:p>
@@ -2645,37 +2620,7 @@
         <w:pStyle w:val="ListBullet"/>
       </w:pPr>
       <w:r>
-        <w:t>BFS, A* (</w:t>
-      </w:r>
-      <w:r>
-        <w:rPr>
-          <w:rFonts w:ascii="Consolas" w:hAnsi="Consolas"/>
-          <w:sz w:val="20"/>
-        </w:rPr>
-        <w:t>AS</w:t>
-      </w:r>
-      <w:r>
-        <w:t>), uniform-cost search (</w:t>
-      </w:r>
-      <w:r>
-        <w:rPr>
-          <w:rFonts w:ascii="Consolas" w:hAnsi="Consolas"/>
-          <w:sz w:val="20"/>
-        </w:rPr>
-        <w:t>CUS1</w:t>
-      </w:r>
-      <w:r>
-        <w:t>), and move-count A* (</w:t>
-      </w:r>
-      <w:r>
-        <w:rPr>
-          <w:rFonts w:ascii="Consolas" w:hAnsi="Consolas"/>
-          <w:sz w:val="20"/>
-        </w:rPr>
-        <w:t>CUS2</w:t>
-      </w:r>
-      <w:r>
-        <w:t>).</w:t>
+        <w:t>BFS, A* (AS), uniform-cost search (CUS1), and scaled-heuristic cost A* (CUS2, w = 0.8).</w:t>
       </w:r>
     </w:p>
     <w:p>
@@ -2683,7 +2628,7 @@
         <w:pStyle w:val="ListBullet"/>
       </w:pPr>
       <w:r>
-        <w:t>Command-line output in the three-line format required for batch testing.</w:t>
+        <w:t>Command-line output begins with the required three-line result and currently adds labelled details for readability.</w:t>
       </w:r>
     </w:p>
     <w:p>
@@ -2777,37 +2722,7 @@
         <w:pStyle w:val="ListBullet"/>
       </w:pPr>
       <w:r>
-        <w:t xml:space="preserve">If some edge costs less than its straight-line length, the A* heuristic can overestimate and the path from </w:t>
-      </w:r>
-      <w:r>
-        <w:rPr>
-          <w:rFonts w:ascii="Consolas" w:hAnsi="Consolas"/>
-          <w:sz w:val="20"/>
-        </w:rPr>
-        <w:t>AS</w:t>
-      </w:r>
-      <w:r>
-        <w:t xml:space="preserve"> may not be a cheapest path. </w:t>
-      </w:r>
-      <w:r>
-        <w:rPr>
-          <w:rFonts w:ascii="Consolas" w:hAnsi="Consolas"/>
-          <w:sz w:val="20"/>
-        </w:rPr>
-        <w:t>CUS1</w:t>
-      </w:r>
-      <w:r>
-        <w:t xml:space="preserve"> would still be cheapest, because it never uses </w:t>
-      </w:r>
-      <w:r>
-        <w:rPr>
-          <w:rFonts w:ascii="Consolas" w:hAnsi="Consolas"/>
-          <w:sz w:val="20"/>
-        </w:rPr>
-        <w:t>h</w:t>
-      </w:r>
-      <w:r>
-        <w:t>.</w:t>
+        <w:t>If an edge costs less than its straight-line length, the cost heuristic may overestimate. AS and CUS2 may then lose their minimum-cost guarantee; multiplying by 0.8 does not automatically repair every overestimate. CUS1 avoids this heuristic assumption.</w:t>
       </w:r>
     </w:p>
     <w:p>
@@ -2854,17 +2769,7 @@
     </w:p>
     <w:p>
       <w:r>
-        <w:t xml:space="preserve">None. </w:t>
-      </w:r>
-      <w:r>
-        <w:rPr>
-          <w:rFonts w:ascii="Consolas" w:hAnsi="Consolas"/>
-          <w:sz w:val="20"/>
-        </w:rPr>
-        <w:t>python run_tests.py</w:t>
-      </w:r>
-      <w:r>
-        <w:t xml:space="preserve"> passed on all 17 maps on Windows with Python 3.14.</w:t>
+        <w:t>The revised python run_tests.py passed all 17 maps in local validation. This verifies the existing fixtures; it does not prove that no bugs exist.</w:t>
       </w:r>
     </w:p>
     <w:p>
@@ -2884,56 +2789,8 @@
       </w:r>
     </w:p>
     <w:p>
-      <w:r/>
       <w:r>
-        <w:rPr>
-          <w:rFonts w:ascii="Consolas" w:hAnsi="Consolas"/>
-          <w:sz w:val="20"/>
-        </w:rPr>
-        <w:t>run_tests.py</w:t>
-      </w:r>
-      <w:r>
-        <w:t xml:space="preserve"> does not trust the search code to mark its own homework. A separate Dijkstra routine computes the cheapest path and the fewest-move path on the graph. For </w:t>
-      </w:r>
-      <w:r>
-        <w:rPr>
-          <w:rFonts w:ascii="Consolas" w:hAnsi="Consolas"/>
-          <w:sz w:val="20"/>
-        </w:rPr>
-        <w:t>AS</w:t>
-      </w:r>
-      <w:r>
-        <w:t xml:space="preserve"> and </w:t>
-      </w:r>
-      <w:r>
-        <w:rPr>
-          <w:rFonts w:ascii="Consolas" w:hAnsi="Consolas"/>
-          <w:sz w:val="20"/>
-        </w:rPr>
-        <w:t>CUS1</w:t>
-      </w:r>
-      <w:r>
-        <w:t xml:space="preserve"> the path cost must equal the Dijkstra cost. For </w:t>
-      </w:r>
-      <w:r>
-        <w:rPr>
-          <w:rFonts w:ascii="Consolas" w:hAnsi="Consolas"/>
-          <w:sz w:val="20"/>
-        </w:rPr>
-        <w:t>BFS</w:t>
-      </w:r>
-      <w:r>
-        <w:t xml:space="preserve"> and </w:t>
-      </w:r>
-      <w:r>
-        <w:rPr>
-          <w:rFonts w:ascii="Consolas" w:hAnsi="Consolas"/>
-          <w:sz w:val="20"/>
-        </w:rPr>
-        <w:t>CUS2</w:t>
-      </w:r>
-      <w:r>
-        <w:t xml:space="preserve"> the number of moves must equal the fewest-move distance. Each step of the printed path must be a real edge. The command-line text must match the value returned inside the program. Maps that were worked out by hand also check the exact node sequence, which is how the tie-break is tested.</w:t>
+        <w:t>A separate Dijkstra implementation computes reference minimum costs and minimum move counts without calling tree_search. AS, CUS1 and revised CUS2 must match the minimum cost; only BFS must match the minimum moves. Checks also cover valid edges, endpoints, hop counts, selected exact paths, and CLI output. CUS2 expectations were updated for its cost objective.</w:t>
       </w:r>
     </w:p>
     <w:p>
@@ -5670,14 +5527,8 @@
             </w:tcMar>
           </w:tcPr>
           <w:p>
-            <w:pPr>
-              <w:spacing w:line="252" w:lineRule="auto" w:after="60"/>
-            </w:pPr>
             <w:r>
-              <w:rPr>
-                <w:sz w:val="18"/>
-              </w:rPr>
-              <w:t>6</w:t>
+              <w:t>8</w:t>
             </w:r>
           </w:p>
         </w:tc>
@@ -7875,14 +7726,8 @@
             </w:tcMar>
           </w:tcPr>
           <w:p>
-            <w:pPr>
-              <w:spacing w:line="252" w:lineRule="auto" w:after="60"/>
-            </w:pPr>
             <w:r>
-              <w:rPr>
-                <w:sz w:val="18"/>
-              </w:rPr>
-              <w:t>5</w:t>
+              <w:t>4</w:t>
             </w:r>
           </w:p>
         </w:tc>
@@ -7911,7 +7756,7 @@
     </w:p>
     <w:p>
       <w:r>
-        <w:t>On map 16 the path cost is 4, so the edge of cost 3 was used and the edge of cost 10 was not. A* and CUS1 create 4 nodes; BFS and CUS2 create 5, because the extra parallel edge is a separate tree node of equal depth.</w:t>
+        <w:t>On map 16, AS, CUS1 and revised CUS2 create 4 nodes and use a route of cost 4. BFS creates 5 nodes. Parallel edges remain separate search-tree nodes, but the cost-based methods prioritise the cheaper alternative.</w:t>
       </w:r>
     </w:p>
     <w:p>
@@ -7960,6 +7805,7 @@
           </w:tcPr>
           <w:p>
             <w:pPr>
+              <w:keepNext/>
               <w:spacing w:line="252" w:lineRule="auto" w:after="60"/>
             </w:pPr>
             <w:r>
@@ -7991,6 +7837,7 @@
           </w:tcPr>
           <w:p>
             <w:pPr>
+              <w:keepNext/>
               <w:spacing w:line="252" w:lineRule="auto" w:after="60"/>
             </w:pPr>
             <w:r>
@@ -8022,6 +7869,7 @@
           </w:tcPr>
           <w:p>
             <w:pPr>
+              <w:keepNext/>
               <w:spacing w:line="252" w:lineRule="auto" w:after="60"/>
             </w:pPr>
             <w:r>
@@ -8053,6 +7901,7 @@
           </w:tcPr>
           <w:p>
             <w:pPr>
+              <w:keepNext/>
               <w:spacing w:line="252" w:lineRule="auto" w:after="60"/>
             </w:pPr>
             <w:r>
@@ -8084,6 +7933,7 @@
           </w:tcPr>
           <w:p>
             <w:pPr>
+              <w:keepNext/>
               <w:spacing w:line="252" w:lineRule="auto" w:after="60"/>
             </w:pPr>
             <w:r>
@@ -8120,6 +7970,7 @@
           </w:tcPr>
           <w:p>
             <w:pPr>
+              <w:keepNext/>
               <w:spacing w:line="252" w:lineRule="auto" w:after="60"/>
             </w:pPr>
             <w:r>
@@ -8150,6 +8001,7 @@
           </w:tcPr>
           <w:p>
             <w:pPr>
+              <w:keepNext/>
               <w:spacing w:line="252" w:lineRule="auto" w:after="60"/>
             </w:pPr>
             <w:r>
@@ -8180,6 +8032,7 @@
           </w:tcPr>
           <w:p>
             <w:pPr>
+              <w:keepNext/>
               <w:spacing w:line="252" w:lineRule="auto" w:after="60"/>
             </w:pPr>
             <w:r>
@@ -8210,6 +8063,7 @@
           </w:tcPr>
           <w:p>
             <w:pPr>
+              <w:keepNext/>
               <w:spacing w:line="252" w:lineRule="auto" w:after="60"/>
             </w:pPr>
             <w:r>
@@ -8240,13 +8094,10 @@
           </w:tcPr>
           <w:p>
             <w:pPr>
-              <w:spacing w:line="252" w:lineRule="auto" w:after="60"/>
+              <w:keepNext/>
             </w:pPr>
             <w:r>
-              <w:rPr>
-                <w:sz w:val="18"/>
-              </w:rPr>
-              <w:t>path 1 4, cost 100, 1 move, 3 created</w:t>
+              <w:t>path 1 2 3 4, cost 3, 3 moves, 5 created</w:t>
             </w:r>
           </w:p>
         </w:tc>
@@ -8275,6 +8126,7 @@
           </w:tcPr>
           <w:p>
             <w:pPr>
+              <w:keepNext/>
               <w:spacing w:line="252" w:lineRule="auto" w:after="60"/>
             </w:pPr>
             <w:r>
@@ -8305,6 +8157,7 @@
           </w:tcPr>
           <w:p>
             <w:pPr>
+              <w:keepNext/>
               <w:spacing w:line="252" w:lineRule="auto" w:after="60"/>
             </w:pPr>
             <w:r>
@@ -8335,6 +8188,7 @@
           </w:tcPr>
           <w:p>
             <w:pPr>
+              <w:keepNext/>
               <w:spacing w:line="252" w:lineRule="auto" w:after="60"/>
             </w:pPr>
             <w:r>
@@ -8365,6 +8219,7 @@
           </w:tcPr>
           <w:p>
             <w:pPr>
+              <w:keepNext/>
               <w:spacing w:line="252" w:lineRule="auto" w:after="60"/>
             </w:pPr>
             <w:r>
@@ -8395,13 +8250,10 @@
           </w:tcPr>
           <w:p>
             <w:pPr>
-              <w:spacing w:line="252" w:lineRule="auto" w:after="60"/>
+              <w:keepNext/>
             </w:pPr>
             <w:r>
-              <w:rPr>
-                <w:sz w:val="18"/>
-              </w:rPr>
-              <w:t>same path as BFS</w:t>
+              <w:t>same path as AS</w:t>
             </w:r>
           </w:p>
         </w:tc>
@@ -8430,6 +8282,7 @@
           </w:tcPr>
           <w:p>
             <w:pPr>
+              <w:keepNext/>
               <w:spacing w:line="252" w:lineRule="auto" w:after="60"/>
             </w:pPr>
             <w:r>
@@ -8460,6 +8313,7 @@
           </w:tcPr>
           <w:p>
             <w:pPr>
+              <w:keepNext/>
               <w:spacing w:line="252" w:lineRule="auto" w:after="60"/>
             </w:pPr>
             <w:r>
@@ -8490,6 +8344,7 @@
           </w:tcPr>
           <w:p>
             <w:pPr>
+              <w:keepNext/>
               <w:spacing w:line="252" w:lineRule="auto" w:after="60"/>
             </w:pPr>
             <w:r>
@@ -8520,6 +8375,7 @@
           </w:tcPr>
           <w:p>
             <w:pPr>
+              <w:keepNext/>
               <w:spacing w:line="252" w:lineRule="auto" w:after="60"/>
             </w:pPr>
             <w:r>
@@ -8550,13 +8406,10 @@
           </w:tcPr>
           <w:p>
             <w:pPr>
-              <w:spacing w:line="252" w:lineRule="auto" w:after="60"/>
+              <w:keepNext/>
             </w:pPr>
             <w:r>
-              <w:rPr>
-                <w:sz w:val="18"/>
-              </w:rPr>
-              <w:t>path 1 6, cost 8, 1 move, 3 created</w:t>
+              <w:t>path 1 2 4, cost 2, 2 moves, 4 created</w:t>
             </w:r>
           </w:p>
         </w:tc>
@@ -8704,14 +8557,8 @@
             </w:tcMar>
           </w:tcPr>
           <w:p>
-            <w:pPr>
-              <w:spacing w:line="252" w:lineRule="auto" w:after="60"/>
-            </w:pPr>
             <w:r>
-              <w:rPr>
-                <w:sz w:val="18"/>
-              </w:rPr>
-              <w:t>path 1 6 7, cost 23, 2 moves, 10 created</w:t>
+              <w:t>path 1 2 4 7, cost 11, 3 moves, 20 created</w:t>
             </w:r>
           </w:p>
         </w:tc>
@@ -8720,7 +8567,7 @@
     <w:p/>
     <w:p>
       <w:r>
-        <w:t>Map 8 is a tie, not a disagreement about quality. Both paths cost 6 and both have 2 moves. BFS meets node 2 before node 3 because 2 is the smaller id, so the goal copy that arrives through node 2 is the one expanded. CUS1 meets node 3 first because that branch has g = 1, against g = 2 on the branch through node 2. The goal copy through node 3 is therefore added earlier, and the second tie-break keeps it. A* follows the cost ranking. CUS2 follows the move ranking, which at equal depth falls back to the smaller id, like BFS.</w:t>
+        <w:t>Map 8 has equal-cost alternatives: both cost 6 and use 2 moves. BFS returns 1 2 4. CUS1, AS and revised CUS2 return 1 3 4. With cost ranking, node 3 is reached at lower accumulated cost, and its goal copy is added earlier. This is a tie-breaking difference, not a quality difference.</w:t>
       </w:r>
     </w:p>
     <w:p>
@@ -8768,7 +8615,7 @@
     </w:p>
     <w:p>
       <w:r>
-        <w:t>The useful question is not “which algorithm is best”, but which quantity we asked it to minimise, and how many tree nodes it built while doing that.</w:t>
+        <w:t>The revised comparison separates the optimisation objective from heuristic influence: BFS minimises moves, while CUS1, AS and CUS2 minimise cost with different levels of heuristic guidance.</w:t>
       </w:r>
     </w:p>
     <w:p>
@@ -8776,7 +8623,7 @@
         <w:pStyle w:val="Heading2"/>
       </w:pPr>
       <w:r>
-        <w:t>5 1 Same optimum  less work</w:t>
+        <w:t>5 1 Equal solutions with different search effort</w:t>
       </w:r>
     </w:p>
     <w:p>
@@ -9298,22 +9145,12 @@
     <w:p/>
     <w:p>
       <w:r>
-        <w:t>A* and CUS2 generate the cheap-looking branches first and meet a destination before the rest of the tree exists. With only one destination (map 2, goal 5 only), the gap grows. BFS and CUS1 create 13 nodes. A* creates 8. CUS2 creates 6. The straight-line estimate points at node 3, which really is the right first step toward node 5, so the informed searches barely leave that branch.</w:t>
+        <w:t>On the sample map, AS and CUS2 both create 8 nodes and remove 4, compared with 11 created and 6 removed for BFS and CUS1. With only goal 5 (map 2), AS and CUS2 each create 8 nodes, while BFS and CUS1 each create 13. A changed weight need not change the route or node counts.</w:t>
       </w:r>
     </w:p>
     <w:p>
       <w:r>
-        <w:t xml:space="preserve">Uniform-cost search does not win on this map. The cheapest path is also a shortest-move path, and the edge costs are similar, so ordering by </w:t>
-      </w:r>
-      <w:r>
-        <w:rPr>
-          <w:rFonts w:ascii="Consolas" w:hAnsi="Consolas"/>
-          <w:sz w:val="20"/>
-        </w:rPr>
-        <w:t>g</w:t>
-      </w:r>
-      <w:r>
-        <w:t xml:space="preserve"> removes the destination at about the same time as ordering by depth. The heuristic is what reduces the tree, not the change from depth to cost.</w:t>
+        <w:t>In these fixtures the geometric estimate directs informed methods toward useful branches. CUS2 weakens that estimate relative to AS; the results do not establish a universal performance advantage for either method.</w:t>
       </w:r>
     </w:p>
     <w:p>
@@ -9321,55 +9158,17 @@
         <w:pStyle w:val="Heading2"/>
       </w:pPr>
       <w:r>
-        <w:t>5 2 Cost and moves are different questions</w:t>
+        <w:t>5 2 Cost and moves are different objectives</w:t>
       </w:r>
     </w:p>
     <w:p>
       <w:r>
-        <w:t xml:space="preserve">Map 5 is a line of towns. The direct road from 1 to 4 costs 100. The road 1–2–3–4 costs 3. BFS returns </w:t>
-      </w:r>
-      <w:r>
-        <w:rPr>
-          <w:rFonts w:ascii="Consolas" w:hAnsi="Consolas"/>
-          <w:sz w:val="20"/>
-        </w:rPr>
-        <w:t>1 4</w:t>
-      </w:r>
-      <w:r>
-        <w:t xml:space="preserve">. That is the correct </w:t>
-      </w:r>
-      <w:r>
-        <w:rPr>
-          <w:b/>
-        </w:rPr>
-        <w:t>fewest-move</w:t>
-      </w:r>
-      <w:r>
-        <w:t xml:space="preserve"> answer and a poor </w:t>
-      </w:r>
-      <w:r>
-        <w:rPr>
-          <w:b/>
-        </w:rPr>
-        <w:t>cheapest-path</w:t>
-      </w:r>
-      <w:r>
-        <w:t xml:space="preserve"> answer. A* and CUS1 return </w:t>
-      </w:r>
-      <w:r>
-        <w:rPr>
-          <w:rFonts w:ascii="Consolas" w:hAnsi="Consolas"/>
-          <w:sz w:val="20"/>
-        </w:rPr>
-        <w:t>1 2 3 4</w:t>
-      </w:r>
-      <w:r>
-        <w:t xml:space="preserve"> at cost 3. CUS2 agrees with BFS, and it creates only 3 nodes to do it, because the distance heuristic sees that the goal is one long step away.</w:t>
+        <w:t>On map 5, BFS returns 1 4 at cost 100 in one move. AS, CUS1 and revised CUS2 return 1 2 3 4 at cost 3 in three moves. CUS2 now agrees with the minimum-cost methods rather than BFS. AS and CUS2 each create 5 nodes.</w:t>
       </w:r>
     </w:p>
     <w:p>
       <w:r>
-        <w:t>Map 12 is the same lesson with two legal goals. BFS and CUS2 go to node 6 in one move and pay 8. A* and CUS1 go to node 4 in two moves and pay 2. Both answers are correct for the objective written in the table in Section 2.3. A marker who wanted the lowest cost would call the BFS path wrong. A marker who wanted the least moves would call the A* path wrong. The specification’s main objective is lowest cost, and it separately asks CUS2 for least moves. The program follows that split on purpose.</w:t>
+        <w:t>On map 12, BFS chooses goal 6 in one move at cost 8. AS, CUS1 and revised CUS2 choose goal 4 in two moves at cost 2. This is consistent with the revised objectives: CUS2 is no longer a minimum-move method.</w:t>
       </w:r>
     </w:p>
     <w:p>
@@ -9811,13 +9610,7 @@
             </w:tcMar>
           </w:tcPr>
           <w:p>
-            <w:pPr>
-              <w:spacing w:line="252" w:lineRule="auto" w:after="60"/>
-            </w:pPr>
             <w:r>
-              <w:rPr>
-                <w:sz w:val="18"/>
-              </w:rPr>
               <w:t>CUS2</w:t>
             </w:r>
           </w:p>
@@ -9841,14 +9634,8 @@
             </w:tcMar>
           </w:tcPr>
           <w:p>
-            <w:pPr>
-              <w:spacing w:line="252" w:lineRule="auto" w:after="60"/>
-            </w:pPr>
             <w:r>
-              <w:rPr>
-                <w:sz w:val="18"/>
-              </w:rPr>
-              <w:t>1 6 7</w:t>
+              <w:t>1 2 4 7</w:t>
             </w:r>
           </w:p>
         </w:tc>
@@ -9871,14 +9658,8 @@
             </w:tcMar>
           </w:tcPr>
           <w:p>
-            <w:pPr>
-              <w:spacing w:line="252" w:lineRule="auto" w:after="60"/>
-            </w:pPr>
             <w:r>
-              <w:rPr>
-                <w:sz w:val="18"/>
-              </w:rPr>
-              <w:t>23</w:t>
+              <w:t>11</w:t>
             </w:r>
           </w:p>
         </w:tc>
@@ -9901,14 +9682,8 @@
             </w:tcMar>
           </w:tcPr>
           <w:p>
-            <w:pPr>
-              <w:spacing w:line="252" w:lineRule="auto" w:after="60"/>
-            </w:pPr>
             <w:r>
-              <w:rPr>
-                <w:sz w:val="18"/>
-              </w:rPr>
-              <w:t>2</w:t>
+              <w:t>3</w:t>
             </w:r>
           </w:p>
         </w:tc>
@@ -9931,14 +9706,8 @@
             </w:tcMar>
           </w:tcPr>
           <w:p>
-            <w:pPr>
-              <w:spacing w:line="252" w:lineRule="auto" w:after="60"/>
-            </w:pPr>
             <w:r>
-              <w:rPr>
-                <w:sz w:val="18"/>
-              </w:rPr>
-              <w:t>10</w:t>
+              <w:t>20</w:t>
             </w:r>
           </w:p>
         </w:tc>
@@ -9961,14 +9730,8 @@
             </w:tcMar>
           </w:tcPr>
           <w:p>
-            <w:pPr>
-              <w:spacing w:line="252" w:lineRule="auto" w:after="60"/>
-            </w:pPr>
             <w:r>
-              <w:rPr>
-                <w:sz w:val="18"/>
-              </w:rPr>
-              <w:t>5</w:t>
+              <w:t>10</w:t>
             </w:r>
           </w:p>
         </w:tc>
@@ -10347,25 +10110,7 @@
     <w:p/>
     <w:p>
       <w:r>
-        <w:t xml:space="preserve">Read down the “Created” column. For the </w:t>
-      </w:r>
-      <w:r>
-        <w:rPr>
-          <w:b/>
-        </w:rPr>
-        <w:t>cost</w:t>
-      </w:r>
-      <w:r>
-        <w:t xml:space="preserve"> objective, A* and CUS1 both find cost 11, and A* builds the smaller tree (16 against 24). The heuristic is doing real work: CUS1 has to open the toll road and the cross links before g = 11 is the best thing left in the frontier. For the </w:t>
-      </w:r>
-      <w:r>
-        <w:rPr>
-          <w:b/>
-        </w:rPr>
-        <w:t>move</w:t>
-      </w:r>
-      <w:r>
-        <w:t xml:space="preserve"> objective, CUS2 and BFS both find a two-move path, and CUS2 builds the smaller tree (10 against 18). An informed method is better than the matching uninformed method on both objectives. It is not better than a method that was given a different objective.</w:t>
+        <w:t>On map 13, AS, CUS2 and CUS1 all find cost 11. AS creates 16 nodes and removes 8; CUS2 creates 20 and removes 10; CUS1 creates 24 and removes 12. Here the 0.8 setting does more work than full-strength A*, but less than UCS. The evidence supports weaker guidance, not guaranteed acceleration.</w:t>
       </w:r>
     </w:p>
     <w:p>
@@ -10373,62 +10118,22 @@
         <w:pStyle w:val="Heading2"/>
       </w:pPr>
       <w:r>
-        <w:t>5 3 What we would run on a new map</w:t>
+        <w:t>5 3 The purpose of heuristic weighting</w:t>
       </w:r>
     </w:p>
     <w:p>
       <w:r>
-        <w:t xml:space="preserve">If the user wants the cheapest route, and edges cost at least their straight-line length, run </w:t>
-      </w:r>
-      <w:r>
-        <w:rPr>
-          <w:rFonts w:ascii="Consolas" w:hAnsi="Consolas"/>
-          <w:sz w:val="20"/>
-        </w:rPr>
-        <w:t>AS</w:t>
-      </w:r>
-      <w:r>
-        <w:t xml:space="preserve">. On map 13 it matched CUS1’s cost and created fewer nodes. If the edge costs can undercut the straight-line distance, </w:t>
-      </w:r>
-      <w:r>
-        <w:rPr>
-          <w:rFonts w:ascii="Consolas" w:hAnsi="Consolas"/>
-          <w:sz w:val="20"/>
-        </w:rPr>
-        <w:t>AS</w:t>
-      </w:r>
-      <w:r>
-        <w:t xml:space="preserve"> is no longer safe and </w:t>
-      </w:r>
-      <w:r>
-        <w:rPr>
-          <w:rFonts w:ascii="Consolas" w:hAnsi="Consolas"/>
-          <w:sz w:val="20"/>
-        </w:rPr>
-        <w:t>CUS1</w:t>
-      </w:r>
-      <w:r>
-        <w:t xml:space="preserve"> is the method that still minimises cost.</w:t>
+        <w:t>The revision asks: how does reducing the cost heuristic weight affect node creation and expansion while preserving the minimum-cost objective? The value 0.8 reduces reliance on estimated remaining cost and increases the relative influence of accumulated actual cost.</w:t>
       </w:r>
     </w:p>
     <w:p>
       <w:r>
-        <w:t xml:space="preserve">If the user wants the fewest turns, run </w:t>
-      </w:r>
-      <w:r>
-        <w:rPr>
-          <w:rFonts w:ascii="Consolas" w:hAnsi="Consolas"/>
-          <w:sz w:val="20"/>
-        </w:rPr>
-        <w:t>CUS2</w:t>
-      </w:r>
-      <w:r>
-        <w:t>. It matched BFS on every hop-optimal test and created fewer nodes on maps 2, 5, 12, and 13. BFS remains the simple explanation of “expand one layer at a time”, which is why we kept it as the lecture uninformed method.</w:t>
+        <w:t>If 0 ≤ h(n) ≤ h*(n), then 0 ≤ 0.8h(n) ≤ h*(n). Thus the scaled heuristic remains admissible under the same sufficient map conditions. This is an application of the standard A* admissibility condition, not evidence that 0.8 is the best parameter (Poole and Mackworth 2017).</w:t>
       </w:r>
     </w:p>
     <w:p>
       <w:r>
-        <w:t>We would not use BFS as the only algorithm for this assignment’s cost objective. Maps 5, 12, and 13 are ordinary roads with different tolls, and BFS pays the toll.</w:t>
+        <w:t>Further experiments could compare w = 0, 0.5, 0.8 and 1 on more maps and measure repeated runtimes as well as node counts. Standard AS remains a useful cost-search baseline, CUS1 the heuristic-free cost baseline, and BFS the move-count baseline.</w:t>
       </w:r>
     </w:p>
     <w:p>
@@ -10651,26 +10356,17 @@
     </w:p>
     <w:p>
       <w:r>
-        <w:t xml:space="preserve">For the route problem as set — one destination, lowest cost, edges at least as long as the straight-line distance — </w:t>
-      </w:r>
-      <w:r>
-        <w:rPr>
-          <w:b/>
-        </w:rPr>
-        <w:t>A</w:t>
-      </w:r>
-      <w:r>
-        <w:t>* is the method we would keep. It found the same cheapest paths as uniform-cost search in these tests and built smaller trees once the map offered a real choice (16 nodes created against 24 on the eight-node map). Uniform-cost search is the right fallback when a distance heuristic would overestimate.</w:t>
+        <w:t>The revised methods are BFS for minimum moves; CUS1 for minimum cost without a heuristic; AS for minimum cost with the full straight-line heuristic; and CUS2 for minimum cost with 80% of that estimate. AS and CUS2 require a suitable cost heuristic; CUS1 remains the fallback when geometry does not provide one.</w:t>
       </w:r>
     </w:p>
     <w:p>
       <w:r>
-        <w:t>Breadth-first search is the right lecture example of an uninformed layer-by-layer search, and it is the right answer when every edge is a turn and turns are all that matter. It is a weak answer when the edges have different costs. CUS2 is the version of that move objective we would actually run: same hop counts as BFS, fewer nodes on the maps where a direction toward the goal was available.</w:t>
+        <w:t>All revised checks passed on 17 maps. On map 13, CUS2 preserved the minimum cost of 11 but created more nodes than AS (20 versus 16) and fewer than CUS1 (24). This demonstrates heuristic-weight sensitivity without claiming a universal ordering.</w:t>
       </w:r>
     </w:p>
     <w:p>
       <w:r>
-        <w:t>The node-count differences are small because the maps are small. The ordering is stable across the tests, and it matches the textbook account: a consistent heuristic does not change the optimum, it changes how much of the tree is built.</w:t>
+        <w:t>The value 0.8 is an experimental design choice. Its purpose is to reduce heuristic influence while preserving admissibility when the base estimate is admissible. Larger maps and a controlled weight study are needed before recommending a parameter for performance.</w:t>
       </w:r>
     </w:p>
     <w:p>
@@ -10761,6 +10457,12 @@
       </w:r>
     </w:p>
     <w:p>
+      <w:pPr/>
+      <w:r>
+        <w:t>Codex was used to revise CUS2 to a cost-based heuristic weight of 0.8, update tests and research explanations, and synchronise this Word draft. The team remains responsible for verifying the content and explaining the implementation.</w:t>
+      </w:r>
+    </w:p>
+    <w:p>
       <w:pPr>
         <w:pStyle w:val="Heading1"/>
       </w:pPr>
@@ -10799,6 +10501,16 @@
     <w:p>
       <w:r>
         <w:t>Unit tutor 2026, email to Kian Xiu, October, regarding a reduced set of four search algorithms for a two-person team.</w:t>
+      </w:r>
+    </w:p>
+    <w:p>
+      <w:r>
+        <w:t>Ebendt, R &amp; Drechsler, R 2009, 'Weighted A* search – unifying view and application', Artificial Intelligence, vol. 173, no. 14, pp. 1310–1342. https://doi.org/10.1016/j.artint.2009.06.004. Author-institution record: https://elib.dlr.de/59485/.</w:t>
+      </w:r>
+    </w:p>
+    <w:p>
+      <w:r>
+        <w:t>Poole, DL &amp; Mackworth, AK 2017, Artificial Intelligence: Foundations of Computational Agents, 2nd edn, Section 3.6.1, A* Search. https://www.cs.ubc.ca/~poole/aibook/2e/html2e/ArtInt2e.Ch3.S6.SS1.html.</w:t>
       </w:r>
     </w:p>
     <w:sectPr>

</xml_diff>